<commit_message>
add tasks for topic 02
</commit_message>
<xml_diff>
--- a/TP-KB-251-Yaroslav-Hrab-Ipr.docx
+++ b/TP-KB-251-Yaroslav-Hrab-Ipr.docx
@@ -318,6 +318,7 @@
       </w:pPr>
       <w:r>
         <w:rPr>
+          <w:noProof/>
           <w:lang w:val="ru-RU"/>
         </w:rPr>
         <w:lastRenderedPageBreak/>
@@ -665,6 +666,7 @@
       </w:pPr>
       <w:r>
         <w:rPr>
+          <w:noProof/>
           <w:lang w:val="ru-RU"/>
         </w:rPr>
         <w:lastRenderedPageBreak/>
@@ -964,12 +966,37 @@
           <w:lang w:val="ru-RU"/>
         </w:rPr>
       </w:pPr>
-      <w:r>
-        <w:rPr>
-          <w:lang w:val="ru-RU"/>
-        </w:rPr>
-        <w:t>https://github.com/YaroslavH787/TP-KB-251-Yaroslav-Hrab/blob/main/topic_01/task3.py</w:t>
-      </w:r>
+      <w:hyperlink r:id="rId7" w:history="1">
+        <w:r>
+          <w:rPr>
+            <w:rStyle w:val="a5"/>
+            <w:lang w:val="ru-RU"/>
+          </w:rPr>
+          <w:t>https://github.com/YaroslavH787/TP-KB-251-Yaroslav-Hrab/blob/main/to</w:t>
+        </w:r>
+        <w:r>
+          <w:rPr>
+            <w:rStyle w:val="a5"/>
+            <w:lang w:val="ru-RU"/>
+          </w:rPr>
+          <w:t>p</w:t>
+        </w:r>
+        <w:r>
+          <w:rPr>
+            <w:rStyle w:val="a5"/>
+            <w:lang w:val="ru-RU"/>
+          </w:rPr>
+          <w:t>ic_01/task3.py</w:t>
+        </w:r>
+      </w:hyperlink>
+    </w:p>
+    <w:p>
+      <w:pPr>
+        <w:ind w:right="-705" w:hanging="567"/>
+        <w:rPr>
+          <w:lang w:val="ru-RU"/>
+        </w:rPr>
+      </w:pPr>
     </w:p>
     <w:p>
       <w:pPr>
@@ -1002,6 +1029,7 @@
       </w:pPr>
       <w:r>
         <w:rPr>
+          <w:noProof/>
           <w:lang w:val="ru-RU"/>
         </w:rPr>
         <w:lastRenderedPageBreak/>
@@ -1021,7 +1049,7 @@
                     <pic:cNvPicPr/>
                   </pic:nvPicPr>
                   <pic:blipFill>
-                    <a:blip r:embed="rId7"/>
+                    <a:blip r:embed="rId8"/>
                     <a:stretch>
                       <a:fillRect/>
                     </a:stretch>
@@ -1044,11 +1072,1936 @@
     </w:p>
     <w:p>
       <w:pPr>
+        <w:spacing w:line="259" w:lineRule="auto"/>
         <w:ind w:firstLine="0"/>
-        <w:rPr>
-          <w:lang w:val="ru-RU"/>
-        </w:rPr>
-      </w:pPr>
+        <w:jc w:val="left"/>
+        <w:rPr>
+          <w:lang w:val="ru-RU"/>
+        </w:rPr>
+      </w:pPr>
+      <w:r>
+        <w:rPr>
+          <w:lang w:val="ru-RU"/>
+        </w:rPr>
+        <w:br w:type="page"/>
+      </w:r>
+    </w:p>
+    <w:p>
+      <w:pPr>
+        <w:ind w:firstLine="0"/>
+        <w:jc w:val="center"/>
+        <w:rPr>
+          <w:b/>
+          <w:bCs/>
+          <w:lang w:val="ru-RU"/>
+        </w:rPr>
+      </w:pPr>
+      <w:r>
+        <w:rPr>
+          <w:b/>
+          <w:bCs/>
+          <w:lang w:val="uk-UA"/>
+        </w:rPr>
+        <w:lastRenderedPageBreak/>
+        <w:t xml:space="preserve">Звіт про виконання практичних завдань до лекцій з курсу Технології програмування на мові </w:t>
+      </w:r>
+      <w:r>
+        <w:rPr>
+          <w:b/>
+          <w:bCs/>
+        </w:rPr>
+        <w:t>Python</w:t>
+      </w:r>
+    </w:p>
+    <w:p>
+      <w:pPr>
+        <w:rPr>
+          <w:lang w:val="ru-RU"/>
+        </w:rPr>
+      </w:pPr>
+    </w:p>
+    <w:p>
+      <w:pPr>
+        <w:rPr>
+          <w:lang w:val="ru-RU"/>
+        </w:rPr>
+      </w:pPr>
+    </w:p>
+    <w:p>
+      <w:pPr>
+        <w:jc w:val="right"/>
+        <w:rPr>
+          <w:lang w:val="uk-UA"/>
+        </w:rPr>
+      </w:pPr>
+      <w:r>
+        <w:rPr>
+          <w:lang w:val="uk-UA"/>
+        </w:rPr>
+        <w:t>Звіт до Теми №</w:t>
+      </w:r>
+      <w:r>
+        <w:rPr>
+          <w:lang w:val="uk-UA"/>
+        </w:rPr>
+        <w:t>2</w:t>
+      </w:r>
+    </w:p>
+    <w:p>
+      <w:pPr>
+        <w:jc w:val="right"/>
+        <w:rPr>
+          <w:lang w:val="ru-RU"/>
+        </w:rPr>
+      </w:pPr>
+      <w:r>
+        <w:rPr>
+          <w:lang w:val="ru-RU"/>
+        </w:rPr>
+        <w:t>Умовний перехід</w:t>
+      </w:r>
+    </w:p>
+    <w:p>
+      <w:pPr>
+        <w:rPr>
+          <w:lang w:val="uk-UA"/>
+        </w:rPr>
+      </w:pPr>
+      <w:r>
+        <w:rPr>
+          <w:lang w:val="uk-UA"/>
+        </w:rPr>
+        <w:t>Під час виконання практичного завдання до Теми №</w:t>
+      </w:r>
+      <w:r>
+        <w:rPr>
+          <w:lang w:val="ru-RU"/>
+        </w:rPr>
+        <w:t>2</w:t>
+      </w:r>
+      <w:r>
+        <w:rPr>
+          <w:lang w:val="uk-UA"/>
+        </w:rPr>
+        <w:t xml:space="preserve"> було надано варіанти рішення до наступних задач:</w:t>
+      </w:r>
+    </w:p>
+    <w:p>
+      <w:pPr>
+        <w:pStyle w:val="a4"/>
+        <w:numPr>
+          <w:ilvl w:val="0"/>
+          <w:numId w:val="3"/>
+        </w:numPr>
+        <w:ind w:left="0" w:firstLine="720"/>
+        <w:rPr>
+          <w:lang w:val="uk-UA"/>
+        </w:rPr>
+      </w:pPr>
+      <w:r>
+        <w:rPr>
+          <w:lang w:val="ru-RU"/>
+        </w:rPr>
+        <w:t xml:space="preserve"> </w:t>
+      </w:r>
+      <w:r>
+        <w:rPr>
+          <w:lang w:val="uk-UA"/>
+        </w:rPr>
+        <w:t>Написати функцію пошуку коренів квадратного рівняння використовуючи функцію розрахунку дискримінанту з попередньої теми та умовні переходи.</w:t>
+      </w:r>
+    </w:p>
+    <w:p>
+      <w:pPr>
+        <w:rPr>
+          <w:lang w:val="ru-RU"/>
+        </w:rPr>
+      </w:pPr>
+    </w:p>
+    <w:p>
+      <w:pPr>
+        <w:rPr>
+          <w:lang w:val="uk-UA"/>
+        </w:rPr>
+      </w:pPr>
+      <w:r>
+        <w:rPr>
+          <w:lang w:val="uk-UA"/>
+        </w:rPr>
+        <w:t>Хід виконання завдання:</w:t>
+      </w:r>
+    </w:p>
+    <w:p>
+      <w:pPr>
+        <w:rPr>
+          <w:lang w:val="uk-UA"/>
+        </w:rPr>
+      </w:pPr>
+      <w:r>
+        <w:rPr>
+          <w:lang w:val="uk-UA"/>
+        </w:rPr>
+        <w:t>Текст програми:</w:t>
+      </w:r>
+    </w:p>
+    <w:tbl>
+      <w:tblPr>
+        <w:tblStyle w:val="a3"/>
+        <w:tblW w:w="0" w:type="auto"/>
+        <w:tblInd w:w="805" w:type="dxa"/>
+        <w:tblLook w:val="04A0" w:firstRow="1" w:lastRow="0" w:firstColumn="1" w:lastColumn="0" w:noHBand="0" w:noVBand="1"/>
+      </w:tblPr>
+      <w:tblGrid>
+        <w:gridCol w:w="8545"/>
+      </w:tblGrid>
+      <w:tr>
+        <w:tc>
+          <w:tcPr>
+            <w:tcW w:w="8545" w:type="dxa"/>
+          </w:tcPr>
+          <w:p>
+            <w:pPr>
+              <w:ind w:firstLine="0"/>
+              <w:rPr>
+                <w:rFonts w:ascii="Courier New" w:hAnsi="Courier New" w:cs="Courier New"/>
+                <w:sz w:val="20"/>
+                <w:szCs w:val="20"/>
+                <w:lang w:val="uk-UA"/>
+              </w:rPr>
+            </w:pPr>
+            <w:r>
+              <w:rPr>
+                <w:rFonts w:ascii="Courier New" w:hAnsi="Courier New" w:cs="Courier New"/>
+                <w:sz w:val="20"/>
+                <w:szCs w:val="20"/>
+                <w:lang w:val="uk-UA"/>
+              </w:rPr>
+              <w:t>import math</w:t>
+            </w:r>
+          </w:p>
+          <w:p>
+            <w:pPr>
+              <w:ind w:firstLine="0"/>
+              <w:rPr>
+                <w:rFonts w:ascii="Courier New" w:hAnsi="Courier New" w:cs="Courier New"/>
+                <w:sz w:val="20"/>
+                <w:szCs w:val="20"/>
+                <w:lang w:val="uk-UA"/>
+              </w:rPr>
+            </w:pPr>
+            <w:r>
+              <w:rPr>
+                <w:rFonts w:ascii="Courier New" w:hAnsi="Courier New" w:cs="Courier New"/>
+                <w:sz w:val="20"/>
+                <w:szCs w:val="20"/>
+                <w:lang w:val="uk-UA"/>
+              </w:rPr>
+              <w:t>def discriminant(a, b, c):</w:t>
+            </w:r>
+          </w:p>
+          <w:p>
+            <w:pPr>
+              <w:ind w:firstLine="0"/>
+              <w:rPr>
+                <w:rFonts w:ascii="Courier New" w:hAnsi="Courier New" w:cs="Courier New"/>
+                <w:sz w:val="20"/>
+                <w:szCs w:val="20"/>
+                <w:lang w:val="uk-UA"/>
+              </w:rPr>
+            </w:pPr>
+            <w:r>
+              <w:rPr>
+                <w:rFonts w:ascii="Courier New" w:hAnsi="Courier New" w:cs="Courier New"/>
+                <w:sz w:val="20"/>
+                <w:szCs w:val="20"/>
+                <w:lang w:val="uk-UA"/>
+              </w:rPr>
+              <w:t xml:space="preserve">    return b**2 - 4 * a * c</w:t>
+            </w:r>
+          </w:p>
+          <w:p>
+            <w:pPr>
+              <w:ind w:firstLine="0"/>
+              <w:rPr>
+                <w:rFonts w:ascii="Courier New" w:hAnsi="Courier New" w:cs="Courier New"/>
+                <w:sz w:val="20"/>
+                <w:szCs w:val="20"/>
+                <w:lang w:val="uk-UA"/>
+              </w:rPr>
+            </w:pPr>
+            <w:r>
+              <w:rPr>
+                <w:rFonts w:ascii="Courier New" w:hAnsi="Courier New" w:cs="Courier New"/>
+                <w:sz w:val="20"/>
+                <w:szCs w:val="20"/>
+                <w:lang w:val="uk-UA"/>
+              </w:rPr>
+              <w:t>def roots(a, b, c):</w:t>
+            </w:r>
+          </w:p>
+          <w:p>
+            <w:pPr>
+              <w:ind w:firstLine="0"/>
+              <w:rPr>
+                <w:rFonts w:ascii="Courier New" w:hAnsi="Courier New" w:cs="Courier New"/>
+                <w:sz w:val="20"/>
+                <w:szCs w:val="20"/>
+                <w:lang w:val="uk-UA"/>
+              </w:rPr>
+            </w:pPr>
+            <w:r>
+              <w:rPr>
+                <w:rFonts w:ascii="Courier New" w:hAnsi="Courier New" w:cs="Courier New"/>
+                <w:sz w:val="20"/>
+                <w:szCs w:val="20"/>
+                <w:lang w:val="uk-UA"/>
+              </w:rPr>
+              <w:t xml:space="preserve">    if a == 0:</w:t>
+            </w:r>
+          </w:p>
+          <w:p>
+            <w:pPr>
+              <w:ind w:firstLine="0"/>
+              <w:rPr>
+                <w:rFonts w:ascii="Courier New" w:hAnsi="Courier New" w:cs="Courier New"/>
+                <w:sz w:val="20"/>
+                <w:szCs w:val="20"/>
+                <w:lang w:val="uk-UA"/>
+              </w:rPr>
+            </w:pPr>
+            <w:r>
+              <w:rPr>
+                <w:rFonts w:ascii="Courier New" w:hAnsi="Courier New" w:cs="Courier New"/>
+                <w:sz w:val="20"/>
+                <w:szCs w:val="20"/>
+                <w:lang w:val="uk-UA"/>
+              </w:rPr>
+              <w:t xml:space="preserve">        return "Помилка, 'a' не може дорівнювати 0"</w:t>
+            </w:r>
+          </w:p>
+          <w:p>
+            <w:pPr>
+              <w:ind w:firstLine="0"/>
+              <w:rPr>
+                <w:rFonts w:ascii="Courier New" w:hAnsi="Courier New" w:cs="Courier New"/>
+                <w:sz w:val="20"/>
+                <w:szCs w:val="20"/>
+                <w:lang w:val="uk-UA"/>
+              </w:rPr>
+            </w:pPr>
+            <w:r>
+              <w:rPr>
+                <w:rFonts w:ascii="Courier New" w:hAnsi="Courier New" w:cs="Courier New"/>
+                <w:sz w:val="20"/>
+                <w:szCs w:val="20"/>
+                <w:lang w:val="uk-UA"/>
+              </w:rPr>
+              <w:t xml:space="preserve">    d = discriminant(a, b, c)</w:t>
+            </w:r>
+          </w:p>
+          <w:p>
+            <w:pPr>
+              <w:ind w:firstLine="0"/>
+              <w:rPr>
+                <w:rFonts w:ascii="Courier New" w:hAnsi="Courier New" w:cs="Courier New"/>
+                <w:sz w:val="20"/>
+                <w:szCs w:val="20"/>
+                <w:lang w:val="uk-UA"/>
+              </w:rPr>
+            </w:pPr>
+            <w:r>
+              <w:rPr>
+                <w:rFonts w:ascii="Courier New" w:hAnsi="Courier New" w:cs="Courier New"/>
+                <w:sz w:val="20"/>
+                <w:szCs w:val="20"/>
+                <w:lang w:val="uk-UA"/>
+              </w:rPr>
+              <w:t xml:space="preserve">    print(f"D = {d}") # виводить текст "D = " та підставляє значення змінної d</w:t>
+            </w:r>
+          </w:p>
+          <w:p>
+            <w:pPr>
+              <w:ind w:firstLine="0"/>
+              <w:rPr>
+                <w:rFonts w:ascii="Courier New" w:hAnsi="Courier New" w:cs="Courier New"/>
+                <w:sz w:val="20"/>
+                <w:szCs w:val="20"/>
+                <w:lang w:val="uk-UA"/>
+              </w:rPr>
+            </w:pPr>
+            <w:r>
+              <w:rPr>
+                <w:rFonts w:ascii="Courier New" w:hAnsi="Courier New" w:cs="Courier New"/>
+                <w:sz w:val="20"/>
+                <w:szCs w:val="20"/>
+                <w:lang w:val="uk-UA"/>
+              </w:rPr>
+              <w:t xml:space="preserve">    if d &gt; 0:</w:t>
+            </w:r>
+          </w:p>
+          <w:p>
+            <w:pPr>
+              <w:ind w:firstLine="0"/>
+              <w:rPr>
+                <w:rFonts w:ascii="Courier New" w:hAnsi="Courier New" w:cs="Courier New"/>
+                <w:sz w:val="20"/>
+                <w:szCs w:val="20"/>
+                <w:lang w:val="uk-UA"/>
+              </w:rPr>
+            </w:pPr>
+            <w:r>
+              <w:rPr>
+                <w:rFonts w:ascii="Courier New" w:hAnsi="Courier New" w:cs="Courier New"/>
+                <w:sz w:val="20"/>
+                <w:szCs w:val="20"/>
+                <w:lang w:val="uk-UA"/>
+              </w:rPr>
+              <w:t xml:space="preserve">        x1 = (-b + math.sqrt(d) / (2*a))</w:t>
+            </w:r>
+          </w:p>
+          <w:p>
+            <w:pPr>
+              <w:ind w:firstLine="0"/>
+              <w:rPr>
+                <w:rFonts w:ascii="Courier New" w:hAnsi="Courier New" w:cs="Courier New"/>
+                <w:sz w:val="20"/>
+                <w:szCs w:val="20"/>
+                <w:lang w:val="uk-UA"/>
+              </w:rPr>
+            </w:pPr>
+            <w:r>
+              <w:rPr>
+                <w:rFonts w:ascii="Courier New" w:hAnsi="Courier New" w:cs="Courier New"/>
+                <w:sz w:val="20"/>
+                <w:szCs w:val="20"/>
+                <w:lang w:val="uk-UA"/>
+              </w:rPr>
+              <w:t xml:space="preserve">        x2 = (-b - math.sqrt(d) / (2*a))</w:t>
+            </w:r>
+          </w:p>
+          <w:p>
+            <w:pPr>
+              <w:ind w:firstLine="0"/>
+              <w:rPr>
+                <w:rFonts w:ascii="Courier New" w:hAnsi="Courier New" w:cs="Courier New"/>
+                <w:sz w:val="20"/>
+                <w:szCs w:val="20"/>
+                <w:lang w:val="uk-UA"/>
+              </w:rPr>
+            </w:pPr>
+            <w:r>
+              <w:rPr>
+                <w:rFonts w:ascii="Courier New" w:hAnsi="Courier New" w:cs="Courier New"/>
+                <w:sz w:val="20"/>
+                <w:szCs w:val="20"/>
+                <w:lang w:val="uk-UA"/>
+              </w:rPr>
+              <w:t xml:space="preserve">        return f"Рівняння має два дійсних корені: x1 = {x1}, x2 = {x2}"</w:t>
+            </w:r>
+          </w:p>
+          <w:p>
+            <w:pPr>
+              <w:ind w:firstLine="0"/>
+              <w:rPr>
+                <w:rFonts w:ascii="Courier New" w:hAnsi="Courier New" w:cs="Courier New"/>
+                <w:sz w:val="20"/>
+                <w:szCs w:val="20"/>
+                <w:lang w:val="uk-UA"/>
+              </w:rPr>
+            </w:pPr>
+            <w:r>
+              <w:rPr>
+                <w:rFonts w:ascii="Courier New" w:hAnsi="Courier New" w:cs="Courier New"/>
+                <w:sz w:val="20"/>
+                <w:szCs w:val="20"/>
+                <w:lang w:val="uk-UA"/>
+              </w:rPr>
+              <w:lastRenderedPageBreak/>
+              <w:t xml:space="preserve">    elif d == 0:</w:t>
+            </w:r>
+          </w:p>
+          <w:p>
+            <w:pPr>
+              <w:ind w:firstLine="0"/>
+              <w:rPr>
+                <w:rFonts w:ascii="Courier New" w:hAnsi="Courier New" w:cs="Courier New"/>
+                <w:sz w:val="20"/>
+                <w:szCs w:val="20"/>
+                <w:lang w:val="uk-UA"/>
+              </w:rPr>
+            </w:pPr>
+            <w:r>
+              <w:rPr>
+                <w:rFonts w:ascii="Courier New" w:hAnsi="Courier New" w:cs="Courier New"/>
+                <w:sz w:val="20"/>
+                <w:szCs w:val="20"/>
+                <w:lang w:val="uk-UA"/>
+              </w:rPr>
+              <w:t xml:space="preserve">        x = -b / (2*a)</w:t>
+            </w:r>
+          </w:p>
+          <w:p>
+            <w:pPr>
+              <w:ind w:firstLine="0"/>
+              <w:rPr>
+                <w:rFonts w:ascii="Courier New" w:hAnsi="Courier New" w:cs="Courier New"/>
+                <w:sz w:val="20"/>
+                <w:szCs w:val="20"/>
+                <w:lang w:val="uk-UA"/>
+              </w:rPr>
+            </w:pPr>
+            <w:r>
+              <w:rPr>
+                <w:rFonts w:ascii="Courier New" w:hAnsi="Courier New" w:cs="Courier New"/>
+                <w:sz w:val="20"/>
+                <w:szCs w:val="20"/>
+                <w:lang w:val="uk-UA"/>
+              </w:rPr>
+              <w:t xml:space="preserve">        return f"Рівняння має один дійсний корінь: x = {x}"</w:t>
+            </w:r>
+          </w:p>
+          <w:p>
+            <w:pPr>
+              <w:ind w:firstLine="0"/>
+              <w:rPr>
+                <w:rFonts w:ascii="Courier New" w:hAnsi="Courier New" w:cs="Courier New"/>
+                <w:sz w:val="20"/>
+                <w:szCs w:val="20"/>
+                <w:lang w:val="uk-UA"/>
+              </w:rPr>
+            </w:pPr>
+            <w:r>
+              <w:rPr>
+                <w:rFonts w:ascii="Courier New" w:hAnsi="Courier New" w:cs="Courier New"/>
+                <w:sz w:val="20"/>
+                <w:szCs w:val="20"/>
+                <w:lang w:val="uk-UA"/>
+              </w:rPr>
+              <w:t xml:space="preserve">    else:</w:t>
+            </w:r>
+          </w:p>
+          <w:p>
+            <w:pPr>
+              <w:ind w:firstLine="0"/>
+              <w:rPr>
+                <w:rFonts w:ascii="Courier New" w:hAnsi="Courier New" w:cs="Courier New"/>
+                <w:sz w:val="20"/>
+                <w:szCs w:val="20"/>
+                <w:lang w:val="uk-UA"/>
+              </w:rPr>
+            </w:pPr>
+            <w:r>
+              <w:rPr>
+                <w:rFonts w:ascii="Courier New" w:hAnsi="Courier New" w:cs="Courier New"/>
+                <w:sz w:val="20"/>
+                <w:szCs w:val="20"/>
+                <w:lang w:val="uk-UA"/>
+              </w:rPr>
+              <w:t xml:space="preserve">        return "Рівняння не має дійсних коренів (D &lt; 0)."</w:t>
+            </w:r>
+          </w:p>
+          <w:p>
+            <w:pPr>
+              <w:ind w:firstLine="0"/>
+              <w:rPr>
+                <w:rFonts w:ascii="Courier New" w:hAnsi="Courier New" w:cs="Courier New"/>
+                <w:sz w:val="20"/>
+                <w:szCs w:val="20"/>
+                <w:lang w:val="uk-UA"/>
+              </w:rPr>
+            </w:pPr>
+          </w:p>
+          <w:p>
+            <w:pPr>
+              <w:ind w:firstLine="0"/>
+              <w:rPr>
+                <w:rFonts w:ascii="Courier New" w:hAnsi="Courier New" w:cs="Courier New"/>
+                <w:sz w:val="20"/>
+                <w:szCs w:val="20"/>
+                <w:lang w:val="uk-UA"/>
+              </w:rPr>
+            </w:pPr>
+            <w:r>
+              <w:rPr>
+                <w:rFonts w:ascii="Courier New" w:hAnsi="Courier New" w:cs="Courier New"/>
+                <w:sz w:val="20"/>
+                <w:szCs w:val="20"/>
+                <w:lang w:val="uk-UA"/>
+              </w:rPr>
+              <w:t>a, b, c = 1, -5, 6</w:t>
+            </w:r>
+          </w:p>
+          <w:p>
+            <w:pPr>
+              <w:ind w:firstLine="0"/>
+              <w:rPr>
+                <w:rFonts w:ascii="Courier New" w:hAnsi="Courier New" w:cs="Courier New"/>
+                <w:sz w:val="20"/>
+                <w:szCs w:val="20"/>
+                <w:lang w:val="uk-UA"/>
+              </w:rPr>
+            </w:pPr>
+            <w:r>
+              <w:rPr>
+                <w:rFonts w:ascii="Courier New" w:hAnsi="Courier New" w:cs="Courier New"/>
+                <w:sz w:val="20"/>
+                <w:szCs w:val="20"/>
+                <w:lang w:val="uk-UA"/>
+              </w:rPr>
+              <w:t>print(roots(a, b, c))</w:t>
+            </w:r>
+          </w:p>
+        </w:tc>
+      </w:tr>
+    </w:tbl>
+    <w:p>
+      <w:pPr>
+        <w:rPr>
+          <w:lang w:val="uk-UA"/>
+        </w:rPr>
+      </w:pPr>
+    </w:p>
+    <w:p>
+      <w:pPr>
+        <w:rPr>
+          <w:lang w:val="ru-RU"/>
+        </w:rPr>
+      </w:pPr>
+      <w:r>
+        <w:rPr>
+          <w:lang w:val="uk-UA"/>
+        </w:rPr>
+        <w:t xml:space="preserve">Посилання на </w:t>
+      </w:r>
+      <w:r>
+        <w:t>github</w:t>
+      </w:r>
+      <w:r>
+        <w:rPr>
+          <w:lang w:val="ru-RU"/>
+        </w:rPr>
+        <w:t>:</w:t>
+      </w:r>
+    </w:p>
+    <w:p>
+      <w:pPr>
+        <w:ind w:right="-705" w:hanging="284"/>
+        <w:rPr>
+          <w:lang w:val="ru-RU"/>
+        </w:rPr>
+      </w:pPr>
+      <w:r>
+        <w:rPr>
+          <w:lang w:val="ru-RU"/>
+        </w:rPr>
+        <w:t>https://github.com/YaroslavH787/TP-KB-251-Yaroslav-Hrab/blob/main/topic_0</w:t>
+      </w:r>
+      <w:r>
+        <w:rPr>
+          <w:lang w:val="ru-RU"/>
+        </w:rPr>
+        <w:t>2</w:t>
+      </w:r>
+      <w:r>
+        <w:rPr>
+          <w:lang w:val="ru-RU"/>
+        </w:rPr>
+        <w:t>/task1.py</w:t>
+      </w:r>
+    </w:p>
+    <w:p>
+      <w:pPr>
+        <w:rPr>
+          <w:lang w:val="ru-RU"/>
+        </w:rPr>
+      </w:pPr>
+      <w:r>
+        <w:rPr>
+          <w:lang w:val="uk-UA"/>
+        </w:rPr>
+        <w:t xml:space="preserve">Знімок екрану з посилання на </w:t>
+      </w:r>
+      <w:r>
+        <w:t>github</w:t>
+      </w:r>
+      <w:r>
+        <w:rPr>
+          <w:lang w:val="ru-RU"/>
+        </w:rPr>
+        <w:t>:</w:t>
+      </w:r>
+    </w:p>
+    <w:p>
+      <w:pPr>
+        <w:ind w:firstLine="284"/>
+        <w:rPr>
+          <w:lang w:val="ru-RU"/>
+        </w:rPr>
+      </w:pPr>
+      <w:r>
+        <w:rPr>
+          <w:lang w:val="ru-RU"/>
+        </w:rPr>
+        <w:drawing>
+          <wp:inline distT="0" distB="0" distL="0" distR="0" wp14:anchorId="6D38E74F" wp14:editId="62C4AC9B">
+            <wp:extent cx="5943600" cy="4692015"/>
+            <wp:effectExtent l="0" t="0" r="0" b="0"/>
+            <wp:docPr id="7" name="Рисунок 7"/>
+            <wp:cNvGraphicFramePr>
+              <a:graphicFrameLocks xmlns:a="http://schemas.openxmlformats.org/drawingml/2006/main" noChangeAspect="1"/>
+            </wp:cNvGraphicFramePr>
+            <a:graphic xmlns:a="http://schemas.openxmlformats.org/drawingml/2006/main">
+              <a:graphicData uri="http://schemas.openxmlformats.org/drawingml/2006/picture">
+                <pic:pic xmlns:pic="http://schemas.openxmlformats.org/drawingml/2006/picture">
+                  <pic:nvPicPr>
+                    <pic:cNvPr id="1" name=""/>
+                    <pic:cNvPicPr/>
+                  </pic:nvPicPr>
+                  <pic:blipFill>
+                    <a:blip r:embed="rId9"/>
+                    <a:stretch>
+                      <a:fillRect/>
+                    </a:stretch>
+                  </pic:blipFill>
+                  <pic:spPr>
+                    <a:xfrm>
+                      <a:off x="0" y="0"/>
+                      <a:ext cx="5943600" cy="4692015"/>
+                    </a:xfrm>
+                    <a:prstGeom prst="rect">
+                      <a:avLst/>
+                    </a:prstGeom>
+                  </pic:spPr>
+                </pic:pic>
+              </a:graphicData>
+            </a:graphic>
+          </wp:inline>
+        </w:drawing>
+      </w:r>
+    </w:p>
+    <w:p>
+      <w:pPr>
+        <w:pStyle w:val="a4"/>
+        <w:numPr>
+          <w:ilvl w:val="0"/>
+          <w:numId w:val="3"/>
+        </w:numPr>
+        <w:ind w:left="0" w:firstLine="720"/>
+        <w:rPr>
+          <w:lang w:val="ru-RU"/>
+        </w:rPr>
+      </w:pPr>
+      <w:r>
+        <w:rPr>
+          <w:lang w:val="ru-RU"/>
+        </w:rPr>
+        <w:lastRenderedPageBreak/>
+        <w:t>Написати програму калькулятор використовуючи if else конструкцію. Кожна операція має бути виконана в окремій функції.</w:t>
+      </w:r>
+    </w:p>
+    <w:p>
+      <w:pPr>
+        <w:rPr>
+          <w:lang w:val="uk-UA"/>
+        </w:rPr>
+      </w:pPr>
+      <w:r>
+        <w:rPr>
+          <w:lang w:val="uk-UA"/>
+        </w:rPr>
+        <w:t>Хід виконання завдання:</w:t>
+      </w:r>
+    </w:p>
+    <w:p>
+      <w:pPr>
+        <w:rPr>
+          <w:lang w:val="uk-UA"/>
+        </w:rPr>
+      </w:pPr>
+      <w:r>
+        <w:rPr>
+          <w:lang w:val="uk-UA"/>
+        </w:rPr>
+        <w:t>Текст програми:</w:t>
+      </w:r>
+    </w:p>
+    <w:tbl>
+      <w:tblPr>
+        <w:tblStyle w:val="a3"/>
+        <w:tblW w:w="0" w:type="auto"/>
+        <w:tblInd w:w="805" w:type="dxa"/>
+        <w:tblLook w:val="04A0" w:firstRow="1" w:lastRow="0" w:firstColumn="1" w:lastColumn="0" w:noHBand="0" w:noVBand="1"/>
+      </w:tblPr>
+      <w:tblGrid>
+        <w:gridCol w:w="8545"/>
+      </w:tblGrid>
+      <w:tr>
+        <w:tc>
+          <w:tcPr>
+            <w:tcW w:w="8545" w:type="dxa"/>
+          </w:tcPr>
+          <w:p>
+            <w:pPr>
+              <w:ind w:firstLine="0"/>
+              <w:rPr>
+                <w:rFonts w:ascii="Courier New" w:hAnsi="Courier New" w:cs="Courier New"/>
+                <w:sz w:val="20"/>
+                <w:szCs w:val="20"/>
+                <w:lang w:val="uk-UA"/>
+              </w:rPr>
+            </w:pPr>
+            <w:r>
+              <w:rPr>
+                <w:rFonts w:ascii="Courier New" w:hAnsi="Courier New" w:cs="Courier New"/>
+                <w:sz w:val="20"/>
+                <w:szCs w:val="20"/>
+                <w:lang w:val="uk-UA"/>
+              </w:rPr>
+              <w:t>def plus(x, y): return x + y</w:t>
+            </w:r>
+          </w:p>
+          <w:p>
+            <w:pPr>
+              <w:ind w:firstLine="0"/>
+              <w:rPr>
+                <w:rFonts w:ascii="Courier New" w:hAnsi="Courier New" w:cs="Courier New"/>
+                <w:sz w:val="20"/>
+                <w:szCs w:val="20"/>
+                <w:lang w:val="uk-UA"/>
+              </w:rPr>
+            </w:pPr>
+            <w:r>
+              <w:rPr>
+                <w:rFonts w:ascii="Courier New" w:hAnsi="Courier New" w:cs="Courier New"/>
+                <w:sz w:val="20"/>
+                <w:szCs w:val="20"/>
+                <w:lang w:val="uk-UA"/>
+              </w:rPr>
+              <w:t>def minus(x, y): return x - y</w:t>
+            </w:r>
+          </w:p>
+          <w:p>
+            <w:pPr>
+              <w:ind w:firstLine="0"/>
+              <w:rPr>
+                <w:rFonts w:ascii="Courier New" w:hAnsi="Courier New" w:cs="Courier New"/>
+                <w:sz w:val="20"/>
+                <w:szCs w:val="20"/>
+                <w:lang w:val="uk-UA"/>
+              </w:rPr>
+            </w:pPr>
+            <w:r>
+              <w:rPr>
+                <w:rFonts w:ascii="Courier New" w:hAnsi="Courier New" w:cs="Courier New"/>
+                <w:sz w:val="20"/>
+                <w:szCs w:val="20"/>
+                <w:lang w:val="uk-UA"/>
+              </w:rPr>
+              <w:t>def mnozennia(x, y): return x * y</w:t>
+            </w:r>
+          </w:p>
+          <w:p>
+            <w:pPr>
+              <w:ind w:firstLine="0"/>
+              <w:rPr>
+                <w:rFonts w:ascii="Courier New" w:hAnsi="Courier New" w:cs="Courier New"/>
+                <w:sz w:val="20"/>
+                <w:szCs w:val="20"/>
+                <w:lang w:val="uk-UA"/>
+              </w:rPr>
+            </w:pPr>
+            <w:r>
+              <w:rPr>
+                <w:rFonts w:ascii="Courier New" w:hAnsi="Courier New" w:cs="Courier New"/>
+                <w:sz w:val="20"/>
+                <w:szCs w:val="20"/>
+                <w:lang w:val="uk-UA"/>
+              </w:rPr>
+              <w:t xml:space="preserve">def dilennia(x, y): </w:t>
+            </w:r>
+          </w:p>
+          <w:p>
+            <w:pPr>
+              <w:ind w:firstLine="0"/>
+              <w:rPr>
+                <w:rFonts w:ascii="Courier New" w:hAnsi="Courier New" w:cs="Courier New"/>
+                <w:sz w:val="20"/>
+                <w:szCs w:val="20"/>
+                <w:lang w:val="uk-UA"/>
+              </w:rPr>
+            </w:pPr>
+            <w:r>
+              <w:rPr>
+                <w:rFonts w:ascii="Courier New" w:hAnsi="Courier New" w:cs="Courier New"/>
+                <w:sz w:val="20"/>
+                <w:szCs w:val="20"/>
+                <w:lang w:val="uk-UA"/>
+              </w:rPr>
+              <w:t xml:space="preserve">    if y == 0: </w:t>
+            </w:r>
+          </w:p>
+          <w:p>
+            <w:pPr>
+              <w:ind w:firstLine="0"/>
+              <w:rPr>
+                <w:rFonts w:ascii="Courier New" w:hAnsi="Courier New" w:cs="Courier New"/>
+                <w:sz w:val="20"/>
+                <w:szCs w:val="20"/>
+                <w:lang w:val="uk-UA"/>
+              </w:rPr>
+            </w:pPr>
+            <w:r>
+              <w:rPr>
+                <w:rFonts w:ascii="Courier New" w:hAnsi="Courier New" w:cs="Courier New"/>
+                <w:sz w:val="20"/>
+                <w:szCs w:val="20"/>
+                <w:lang w:val="uk-UA"/>
+              </w:rPr>
+              <w:t xml:space="preserve">        return "Помилка: ділення на нуль!"</w:t>
+            </w:r>
+          </w:p>
+          <w:p>
+            <w:pPr>
+              <w:ind w:firstLine="0"/>
+              <w:rPr>
+                <w:rFonts w:ascii="Courier New" w:hAnsi="Courier New" w:cs="Courier New"/>
+                <w:sz w:val="20"/>
+                <w:szCs w:val="20"/>
+                <w:lang w:val="uk-UA"/>
+              </w:rPr>
+            </w:pPr>
+            <w:r>
+              <w:rPr>
+                <w:rFonts w:ascii="Courier New" w:hAnsi="Courier New" w:cs="Courier New"/>
+                <w:sz w:val="20"/>
+                <w:szCs w:val="20"/>
+                <w:lang w:val="uk-UA"/>
+              </w:rPr>
+              <w:t xml:space="preserve">    return x / y</w:t>
+            </w:r>
+          </w:p>
+          <w:p>
+            <w:pPr>
+              <w:ind w:firstLine="0"/>
+              <w:rPr>
+                <w:rFonts w:ascii="Courier New" w:hAnsi="Courier New" w:cs="Courier New"/>
+                <w:sz w:val="20"/>
+                <w:szCs w:val="20"/>
+                <w:lang w:val="uk-UA"/>
+              </w:rPr>
+            </w:pPr>
+            <w:r>
+              <w:rPr>
+                <w:rFonts w:ascii="Courier New" w:hAnsi="Courier New" w:cs="Courier New"/>
+                <w:sz w:val="20"/>
+                <w:szCs w:val="20"/>
+                <w:lang w:val="uk-UA"/>
+              </w:rPr>
+              <w:t>def calc(x, y, operation):</w:t>
+            </w:r>
+          </w:p>
+          <w:p>
+            <w:pPr>
+              <w:ind w:firstLine="0"/>
+              <w:rPr>
+                <w:rFonts w:ascii="Courier New" w:hAnsi="Courier New" w:cs="Courier New"/>
+                <w:sz w:val="20"/>
+                <w:szCs w:val="20"/>
+                <w:lang w:val="uk-UA"/>
+              </w:rPr>
+            </w:pPr>
+            <w:r>
+              <w:rPr>
+                <w:rFonts w:ascii="Courier New" w:hAnsi="Courier New" w:cs="Courier New"/>
+                <w:sz w:val="20"/>
+                <w:szCs w:val="20"/>
+                <w:lang w:val="uk-UA"/>
+              </w:rPr>
+              <w:t xml:space="preserve">    if operation == '+':</w:t>
+            </w:r>
+          </w:p>
+          <w:p>
+            <w:pPr>
+              <w:ind w:firstLine="0"/>
+              <w:rPr>
+                <w:rFonts w:ascii="Courier New" w:hAnsi="Courier New" w:cs="Courier New"/>
+                <w:sz w:val="20"/>
+                <w:szCs w:val="20"/>
+                <w:lang w:val="uk-UA"/>
+              </w:rPr>
+            </w:pPr>
+            <w:r>
+              <w:rPr>
+                <w:rFonts w:ascii="Courier New" w:hAnsi="Courier New" w:cs="Courier New"/>
+                <w:sz w:val="20"/>
+                <w:szCs w:val="20"/>
+                <w:lang w:val="uk-UA"/>
+              </w:rPr>
+              <w:t xml:space="preserve">        return plus(x, y)</w:t>
+            </w:r>
+          </w:p>
+          <w:p>
+            <w:pPr>
+              <w:ind w:firstLine="0"/>
+              <w:rPr>
+                <w:rFonts w:ascii="Courier New" w:hAnsi="Courier New" w:cs="Courier New"/>
+                <w:sz w:val="20"/>
+                <w:szCs w:val="20"/>
+                <w:lang w:val="uk-UA"/>
+              </w:rPr>
+            </w:pPr>
+            <w:r>
+              <w:rPr>
+                <w:rFonts w:ascii="Courier New" w:hAnsi="Courier New" w:cs="Courier New"/>
+                <w:sz w:val="20"/>
+                <w:szCs w:val="20"/>
+                <w:lang w:val="uk-UA"/>
+              </w:rPr>
+              <w:t xml:space="preserve">    elif operation == '-':</w:t>
+            </w:r>
+          </w:p>
+          <w:p>
+            <w:pPr>
+              <w:ind w:firstLine="0"/>
+              <w:rPr>
+                <w:rFonts w:ascii="Courier New" w:hAnsi="Courier New" w:cs="Courier New"/>
+                <w:sz w:val="20"/>
+                <w:szCs w:val="20"/>
+                <w:lang w:val="uk-UA"/>
+              </w:rPr>
+            </w:pPr>
+            <w:r>
+              <w:rPr>
+                <w:rFonts w:ascii="Courier New" w:hAnsi="Courier New" w:cs="Courier New"/>
+                <w:sz w:val="20"/>
+                <w:szCs w:val="20"/>
+                <w:lang w:val="uk-UA"/>
+              </w:rPr>
+              <w:t xml:space="preserve">            return minus(x, y)</w:t>
+            </w:r>
+          </w:p>
+          <w:p>
+            <w:pPr>
+              <w:ind w:firstLine="0"/>
+              <w:rPr>
+                <w:rFonts w:ascii="Courier New" w:hAnsi="Courier New" w:cs="Courier New"/>
+                <w:sz w:val="20"/>
+                <w:szCs w:val="20"/>
+                <w:lang w:val="uk-UA"/>
+              </w:rPr>
+            </w:pPr>
+            <w:r>
+              <w:rPr>
+                <w:rFonts w:ascii="Courier New" w:hAnsi="Courier New" w:cs="Courier New"/>
+                <w:sz w:val="20"/>
+                <w:szCs w:val="20"/>
+                <w:lang w:val="uk-UA"/>
+              </w:rPr>
+              <w:t xml:space="preserve">    elif operation == '*':</w:t>
+            </w:r>
+          </w:p>
+          <w:p>
+            <w:pPr>
+              <w:ind w:firstLine="0"/>
+              <w:rPr>
+                <w:rFonts w:ascii="Courier New" w:hAnsi="Courier New" w:cs="Courier New"/>
+                <w:sz w:val="20"/>
+                <w:szCs w:val="20"/>
+                <w:lang w:val="uk-UA"/>
+              </w:rPr>
+            </w:pPr>
+            <w:r>
+              <w:rPr>
+                <w:rFonts w:ascii="Courier New" w:hAnsi="Courier New" w:cs="Courier New"/>
+                <w:sz w:val="20"/>
+                <w:szCs w:val="20"/>
+                <w:lang w:val="uk-UA"/>
+              </w:rPr>
+              <w:t xml:space="preserve">            return mnozennia(x, y)</w:t>
+            </w:r>
+          </w:p>
+          <w:p>
+            <w:pPr>
+              <w:ind w:firstLine="0"/>
+              <w:rPr>
+                <w:rFonts w:ascii="Courier New" w:hAnsi="Courier New" w:cs="Courier New"/>
+                <w:sz w:val="20"/>
+                <w:szCs w:val="20"/>
+                <w:lang w:val="uk-UA"/>
+              </w:rPr>
+            </w:pPr>
+            <w:r>
+              <w:rPr>
+                <w:rFonts w:ascii="Courier New" w:hAnsi="Courier New" w:cs="Courier New"/>
+                <w:sz w:val="20"/>
+                <w:szCs w:val="20"/>
+                <w:lang w:val="uk-UA"/>
+              </w:rPr>
+              <w:t xml:space="preserve">    elif operation == '/':</w:t>
+            </w:r>
+          </w:p>
+          <w:p>
+            <w:pPr>
+              <w:ind w:firstLine="0"/>
+              <w:rPr>
+                <w:rFonts w:ascii="Courier New" w:hAnsi="Courier New" w:cs="Courier New"/>
+                <w:sz w:val="20"/>
+                <w:szCs w:val="20"/>
+                <w:lang w:val="uk-UA"/>
+              </w:rPr>
+            </w:pPr>
+            <w:r>
+              <w:rPr>
+                <w:rFonts w:ascii="Courier New" w:hAnsi="Courier New" w:cs="Courier New"/>
+                <w:sz w:val="20"/>
+                <w:szCs w:val="20"/>
+                <w:lang w:val="uk-UA"/>
+              </w:rPr>
+              <w:t xml:space="preserve">            return dilennia(x, y)</w:t>
+            </w:r>
+          </w:p>
+          <w:p>
+            <w:pPr>
+              <w:ind w:firstLine="0"/>
+              <w:rPr>
+                <w:rFonts w:ascii="Courier New" w:hAnsi="Courier New" w:cs="Courier New"/>
+                <w:sz w:val="20"/>
+                <w:szCs w:val="20"/>
+                <w:lang w:val="uk-UA"/>
+              </w:rPr>
+            </w:pPr>
+            <w:r>
+              <w:rPr>
+                <w:rFonts w:ascii="Courier New" w:hAnsi="Courier New" w:cs="Courier New"/>
+                <w:sz w:val="20"/>
+                <w:szCs w:val="20"/>
+                <w:lang w:val="uk-UA"/>
+              </w:rPr>
+              <w:t xml:space="preserve">    else: </w:t>
+            </w:r>
+          </w:p>
+          <w:p>
+            <w:pPr>
+              <w:ind w:firstLine="0"/>
+              <w:rPr>
+                <w:rFonts w:ascii="Courier New" w:hAnsi="Courier New" w:cs="Courier New"/>
+                <w:sz w:val="20"/>
+                <w:szCs w:val="20"/>
+                <w:lang w:val="uk-UA"/>
+              </w:rPr>
+            </w:pPr>
+            <w:r>
+              <w:rPr>
+                <w:rFonts w:ascii="Courier New" w:hAnsi="Courier New" w:cs="Courier New"/>
+                <w:sz w:val="20"/>
+                <w:szCs w:val="20"/>
+                <w:lang w:val="uk-UA"/>
+              </w:rPr>
+              <w:t xml:space="preserve">          return "Помилка: невідома операція!"</w:t>
+            </w:r>
+          </w:p>
+          <w:p>
+            <w:pPr>
+              <w:ind w:firstLine="0"/>
+              <w:rPr>
+                <w:rFonts w:ascii="Courier New" w:hAnsi="Courier New" w:cs="Courier New"/>
+                <w:sz w:val="20"/>
+                <w:szCs w:val="20"/>
+                <w:lang w:val="uk-UA"/>
+              </w:rPr>
+            </w:pPr>
+            <w:r>
+              <w:rPr>
+                <w:rFonts w:ascii="Courier New" w:hAnsi="Courier New" w:cs="Courier New"/>
+                <w:sz w:val="20"/>
+                <w:szCs w:val="20"/>
+                <w:lang w:val="uk-UA"/>
+              </w:rPr>
+              <w:t>print("10 + 5 = ", calc(10, 5, '+'))</w:t>
+            </w:r>
+          </w:p>
+          <w:p>
+            <w:pPr>
+              <w:ind w:firstLine="0"/>
+              <w:rPr>
+                <w:rFonts w:ascii="Courier New" w:hAnsi="Courier New" w:cs="Courier New"/>
+                <w:sz w:val="20"/>
+                <w:szCs w:val="20"/>
+                <w:lang w:val="uk-UA"/>
+              </w:rPr>
+            </w:pPr>
+            <w:r>
+              <w:rPr>
+                <w:rFonts w:ascii="Courier New" w:hAnsi="Courier New" w:cs="Courier New"/>
+                <w:sz w:val="20"/>
+                <w:szCs w:val="20"/>
+                <w:lang w:val="uk-UA"/>
+              </w:rPr>
+              <w:t>print("10 / 0 = ", calc(10, 0, '/'))</w:t>
+            </w:r>
+          </w:p>
+        </w:tc>
+      </w:tr>
+    </w:tbl>
+    <w:p>
+      <w:pPr>
+        <w:rPr>
+          <w:lang w:val="uk-UA"/>
+        </w:rPr>
+      </w:pPr>
+    </w:p>
+    <w:p>
+      <w:pPr>
+        <w:rPr>
+          <w:lang w:val="ru-RU"/>
+        </w:rPr>
+      </w:pPr>
+      <w:r>
+        <w:rPr>
+          <w:lang w:val="uk-UA"/>
+        </w:rPr>
+        <w:t xml:space="preserve">Посилання на </w:t>
+      </w:r>
+      <w:r>
+        <w:t>github</w:t>
+      </w:r>
+      <w:r>
+        <w:rPr>
+          <w:lang w:val="ru-RU"/>
+        </w:rPr>
+        <w:t>:</w:t>
+      </w:r>
+    </w:p>
+    <w:p>
+      <w:pPr>
+        <w:ind w:right="-705" w:hanging="284"/>
+        <w:rPr>
+          <w:lang w:val="ru-RU"/>
+        </w:rPr>
+      </w:pPr>
+      <w:r>
+        <w:rPr>
+          <w:lang w:val="ru-RU"/>
+        </w:rPr>
+        <w:t>https://github.com/YaroslavH787/TP-KB-251-Yaroslav-Hrab/blob/main/topic_0</w:t>
+      </w:r>
+      <w:r>
+        <w:rPr>
+          <w:lang w:val="ru-RU"/>
+        </w:rPr>
+        <w:t>2</w:t>
+      </w:r>
+      <w:r>
+        <w:rPr>
+          <w:lang w:val="ru-RU"/>
+        </w:rPr>
+        <w:t>/task</w:t>
+      </w:r>
+      <w:r>
+        <w:rPr>
+          <w:lang w:val="ru-RU"/>
+        </w:rPr>
+        <w:t>2</w:t>
+      </w:r>
+      <w:r>
+        <w:rPr>
+          <w:lang w:val="ru-RU"/>
+        </w:rPr>
+        <w:t>.py</w:t>
+      </w:r>
+    </w:p>
+    <w:p>
+      <w:pPr>
+        <w:rPr>
+          <w:lang w:val="ru-RU"/>
+        </w:rPr>
+      </w:pPr>
+      <w:r>
+        <w:rPr>
+          <w:lang w:val="uk-UA"/>
+        </w:rPr>
+        <w:t xml:space="preserve">Знімок екрану з посилання на </w:t>
+      </w:r>
+      <w:r>
+        <w:t>github</w:t>
+      </w:r>
+      <w:r>
+        <w:rPr>
+          <w:lang w:val="ru-RU"/>
+        </w:rPr>
+        <w:t>:</w:t>
+      </w:r>
+    </w:p>
+    <w:p>
+      <w:pPr>
+        <w:ind w:firstLine="0"/>
+        <w:rPr>
+          <w:lang w:val="ru-RU"/>
+        </w:rPr>
+      </w:pPr>
+      <w:r>
+        <w:rPr>
+          <w:lang w:val="ru-RU"/>
+        </w:rPr>
+        <w:lastRenderedPageBreak/>
+        <w:drawing>
+          <wp:inline distT="0" distB="0" distL="0" distR="0" wp14:anchorId="7EE057D5" wp14:editId="1241A353">
+            <wp:extent cx="5943600" cy="4592320"/>
+            <wp:effectExtent l="0" t="0" r="0" b="0"/>
+            <wp:docPr id="8" name="Рисунок 8"/>
+            <wp:cNvGraphicFramePr>
+              <a:graphicFrameLocks xmlns:a="http://schemas.openxmlformats.org/drawingml/2006/main" noChangeAspect="1"/>
+            </wp:cNvGraphicFramePr>
+            <a:graphic xmlns:a="http://schemas.openxmlformats.org/drawingml/2006/main">
+              <a:graphicData uri="http://schemas.openxmlformats.org/drawingml/2006/picture">
+                <pic:pic xmlns:pic="http://schemas.openxmlformats.org/drawingml/2006/picture">
+                  <pic:nvPicPr>
+                    <pic:cNvPr id="1" name=""/>
+                    <pic:cNvPicPr/>
+                  </pic:nvPicPr>
+                  <pic:blipFill>
+                    <a:blip r:embed="rId10"/>
+                    <a:stretch>
+                      <a:fillRect/>
+                    </a:stretch>
+                  </pic:blipFill>
+                  <pic:spPr>
+                    <a:xfrm>
+                      <a:off x="0" y="0"/>
+                      <a:ext cx="5943600" cy="4592320"/>
+                    </a:xfrm>
+                    <a:prstGeom prst="rect">
+                      <a:avLst/>
+                    </a:prstGeom>
+                  </pic:spPr>
+                </pic:pic>
+              </a:graphicData>
+            </a:graphic>
+          </wp:inline>
+        </w:drawing>
+      </w:r>
+    </w:p>
+    <w:p>
+      <w:pPr>
+        <w:pStyle w:val="a4"/>
+        <w:numPr>
+          <w:ilvl w:val="0"/>
+          <w:numId w:val="3"/>
+        </w:numPr>
+        <w:ind w:left="0" w:firstLine="720"/>
+        <w:rPr>
+          <w:lang w:val="ru-RU"/>
+        </w:rPr>
+      </w:pPr>
+      <w:r>
+        <w:rPr>
+          <w:lang w:val="ru-RU"/>
+        </w:rPr>
+        <w:t>Написати програму калькулятор використовуючи match конструкцію. Кожна операція має бути виконана в окремій функції.</w:t>
+      </w:r>
+    </w:p>
+    <w:p>
+      <w:pPr>
+        <w:rPr>
+          <w:lang w:val="uk-UA"/>
+        </w:rPr>
+      </w:pPr>
+      <w:r>
+        <w:rPr>
+          <w:lang w:val="uk-UA"/>
+        </w:rPr>
+        <w:t>Хід виконання завдання:</w:t>
+      </w:r>
+    </w:p>
+    <w:p>
+      <w:pPr>
+        <w:rPr>
+          <w:lang w:val="uk-UA"/>
+        </w:rPr>
+      </w:pPr>
+      <w:r>
+        <w:rPr>
+          <w:lang w:val="uk-UA"/>
+        </w:rPr>
+        <w:t>Текст програми:</w:t>
+      </w:r>
+    </w:p>
+    <w:tbl>
+      <w:tblPr>
+        <w:tblStyle w:val="a3"/>
+        <w:tblW w:w="0" w:type="auto"/>
+        <w:tblInd w:w="805" w:type="dxa"/>
+        <w:tblLook w:val="04A0" w:firstRow="1" w:lastRow="0" w:firstColumn="1" w:lastColumn="0" w:noHBand="0" w:noVBand="1"/>
+      </w:tblPr>
+      <w:tblGrid>
+        <w:gridCol w:w="8545"/>
+      </w:tblGrid>
+      <w:tr>
+        <w:tc>
+          <w:tcPr>
+            <w:tcW w:w="8545" w:type="dxa"/>
+          </w:tcPr>
+          <w:p>
+            <w:pPr>
+              <w:ind w:firstLine="0"/>
+              <w:rPr>
+                <w:rFonts w:ascii="Courier New" w:hAnsi="Courier New" w:cs="Courier New"/>
+                <w:sz w:val="20"/>
+                <w:szCs w:val="20"/>
+                <w:lang w:val="uk-UA"/>
+              </w:rPr>
+            </w:pPr>
+            <w:r>
+              <w:rPr>
+                <w:rFonts w:ascii="Courier New" w:hAnsi="Courier New" w:cs="Courier New"/>
+                <w:sz w:val="20"/>
+                <w:szCs w:val="20"/>
+                <w:lang w:val="uk-UA"/>
+              </w:rPr>
+              <w:t>def plus(x, y): return x + y</w:t>
+            </w:r>
+          </w:p>
+          <w:p>
+            <w:pPr>
+              <w:ind w:firstLine="0"/>
+              <w:rPr>
+                <w:rFonts w:ascii="Courier New" w:hAnsi="Courier New" w:cs="Courier New"/>
+                <w:sz w:val="20"/>
+                <w:szCs w:val="20"/>
+                <w:lang w:val="uk-UA"/>
+              </w:rPr>
+            </w:pPr>
+            <w:r>
+              <w:rPr>
+                <w:rFonts w:ascii="Courier New" w:hAnsi="Courier New" w:cs="Courier New"/>
+                <w:sz w:val="20"/>
+                <w:szCs w:val="20"/>
+                <w:lang w:val="uk-UA"/>
+              </w:rPr>
+              <w:t>def minus(x, y): return x - y</w:t>
+            </w:r>
+          </w:p>
+          <w:p>
+            <w:pPr>
+              <w:ind w:firstLine="0"/>
+              <w:rPr>
+                <w:rFonts w:ascii="Courier New" w:hAnsi="Courier New" w:cs="Courier New"/>
+                <w:sz w:val="20"/>
+                <w:szCs w:val="20"/>
+                <w:lang w:val="uk-UA"/>
+              </w:rPr>
+            </w:pPr>
+            <w:r>
+              <w:rPr>
+                <w:rFonts w:ascii="Courier New" w:hAnsi="Courier New" w:cs="Courier New"/>
+                <w:sz w:val="20"/>
+                <w:szCs w:val="20"/>
+                <w:lang w:val="uk-UA"/>
+              </w:rPr>
+              <w:t>def mnozennia(x, y): return x * y</w:t>
+            </w:r>
+          </w:p>
+          <w:p>
+            <w:pPr>
+              <w:ind w:firstLine="0"/>
+              <w:rPr>
+                <w:rFonts w:ascii="Courier New" w:hAnsi="Courier New" w:cs="Courier New"/>
+                <w:sz w:val="20"/>
+                <w:szCs w:val="20"/>
+                <w:lang w:val="uk-UA"/>
+              </w:rPr>
+            </w:pPr>
+            <w:r>
+              <w:rPr>
+                <w:rFonts w:ascii="Courier New" w:hAnsi="Courier New" w:cs="Courier New"/>
+                <w:sz w:val="20"/>
+                <w:szCs w:val="20"/>
+                <w:lang w:val="uk-UA"/>
+              </w:rPr>
+              <w:t xml:space="preserve">def dilennia(x, y): </w:t>
+            </w:r>
+          </w:p>
+          <w:p>
+            <w:pPr>
+              <w:ind w:firstLine="0"/>
+              <w:rPr>
+                <w:rFonts w:ascii="Courier New" w:hAnsi="Courier New" w:cs="Courier New"/>
+                <w:sz w:val="20"/>
+                <w:szCs w:val="20"/>
+                <w:lang w:val="uk-UA"/>
+              </w:rPr>
+            </w:pPr>
+            <w:r>
+              <w:rPr>
+                <w:rFonts w:ascii="Courier New" w:hAnsi="Courier New" w:cs="Courier New"/>
+                <w:sz w:val="20"/>
+                <w:szCs w:val="20"/>
+                <w:lang w:val="uk-UA"/>
+              </w:rPr>
+              <w:t xml:space="preserve">    if y == 0: </w:t>
+            </w:r>
+          </w:p>
+          <w:p>
+            <w:pPr>
+              <w:ind w:firstLine="0"/>
+              <w:rPr>
+                <w:rFonts w:ascii="Courier New" w:hAnsi="Courier New" w:cs="Courier New"/>
+                <w:sz w:val="20"/>
+                <w:szCs w:val="20"/>
+                <w:lang w:val="uk-UA"/>
+              </w:rPr>
+            </w:pPr>
+            <w:r>
+              <w:rPr>
+                <w:rFonts w:ascii="Courier New" w:hAnsi="Courier New" w:cs="Courier New"/>
+                <w:sz w:val="20"/>
+                <w:szCs w:val="20"/>
+                <w:lang w:val="uk-UA"/>
+              </w:rPr>
+              <w:t xml:space="preserve">        return "Помилка: ділення на нуль!"</w:t>
+            </w:r>
+          </w:p>
+          <w:p>
+            <w:pPr>
+              <w:ind w:firstLine="0"/>
+              <w:rPr>
+                <w:rFonts w:ascii="Courier New" w:hAnsi="Courier New" w:cs="Courier New"/>
+                <w:sz w:val="20"/>
+                <w:szCs w:val="20"/>
+                <w:lang w:val="uk-UA"/>
+              </w:rPr>
+            </w:pPr>
+            <w:r>
+              <w:rPr>
+                <w:rFonts w:ascii="Courier New" w:hAnsi="Courier New" w:cs="Courier New"/>
+                <w:sz w:val="20"/>
+                <w:szCs w:val="20"/>
+                <w:lang w:val="uk-UA"/>
+              </w:rPr>
+              <w:t xml:space="preserve">    return x / y</w:t>
+            </w:r>
+          </w:p>
+          <w:p>
+            <w:pPr>
+              <w:ind w:firstLine="0"/>
+              <w:rPr>
+                <w:rFonts w:ascii="Courier New" w:hAnsi="Courier New" w:cs="Courier New"/>
+                <w:sz w:val="20"/>
+                <w:szCs w:val="20"/>
+                <w:lang w:val="uk-UA"/>
+              </w:rPr>
+            </w:pPr>
+            <w:r>
+              <w:rPr>
+                <w:rFonts w:ascii="Courier New" w:hAnsi="Courier New" w:cs="Courier New"/>
+                <w:sz w:val="20"/>
+                <w:szCs w:val="20"/>
+                <w:lang w:val="uk-UA"/>
+              </w:rPr>
+              <w:t>def calc_match(x, y, operation):</w:t>
+            </w:r>
+          </w:p>
+          <w:p>
+            <w:pPr>
+              <w:ind w:firstLine="0"/>
+              <w:rPr>
+                <w:rFonts w:ascii="Courier New" w:hAnsi="Courier New" w:cs="Courier New"/>
+                <w:sz w:val="20"/>
+                <w:szCs w:val="20"/>
+                <w:lang w:val="uk-UA"/>
+              </w:rPr>
+            </w:pPr>
+            <w:r>
+              <w:rPr>
+                <w:rFonts w:ascii="Courier New" w:hAnsi="Courier New" w:cs="Courier New"/>
+                <w:sz w:val="20"/>
+                <w:szCs w:val="20"/>
+                <w:lang w:val="uk-UA"/>
+              </w:rPr>
+              <w:lastRenderedPageBreak/>
+              <w:t xml:space="preserve">    match operation:</w:t>
+            </w:r>
+          </w:p>
+          <w:p>
+            <w:pPr>
+              <w:ind w:firstLine="0"/>
+              <w:rPr>
+                <w:rFonts w:ascii="Courier New" w:hAnsi="Courier New" w:cs="Courier New"/>
+                <w:sz w:val="20"/>
+                <w:szCs w:val="20"/>
+                <w:lang w:val="uk-UA"/>
+              </w:rPr>
+            </w:pPr>
+            <w:r>
+              <w:rPr>
+                <w:rFonts w:ascii="Courier New" w:hAnsi="Courier New" w:cs="Courier New"/>
+                <w:sz w:val="20"/>
+                <w:szCs w:val="20"/>
+                <w:lang w:val="uk-UA"/>
+              </w:rPr>
+              <w:t xml:space="preserve">        case '+':</w:t>
+            </w:r>
+          </w:p>
+          <w:p>
+            <w:pPr>
+              <w:ind w:firstLine="0"/>
+              <w:rPr>
+                <w:rFonts w:ascii="Courier New" w:hAnsi="Courier New" w:cs="Courier New"/>
+                <w:sz w:val="20"/>
+                <w:szCs w:val="20"/>
+                <w:lang w:val="uk-UA"/>
+              </w:rPr>
+            </w:pPr>
+            <w:r>
+              <w:rPr>
+                <w:rFonts w:ascii="Courier New" w:hAnsi="Courier New" w:cs="Courier New"/>
+                <w:sz w:val="20"/>
+                <w:szCs w:val="20"/>
+                <w:lang w:val="uk-UA"/>
+              </w:rPr>
+              <w:t xml:space="preserve">            return plus(x, y)</w:t>
+            </w:r>
+          </w:p>
+          <w:p>
+            <w:pPr>
+              <w:ind w:firstLine="0"/>
+              <w:rPr>
+                <w:rFonts w:ascii="Courier New" w:hAnsi="Courier New" w:cs="Courier New"/>
+                <w:sz w:val="20"/>
+                <w:szCs w:val="20"/>
+                <w:lang w:val="uk-UA"/>
+              </w:rPr>
+            </w:pPr>
+            <w:r>
+              <w:rPr>
+                <w:rFonts w:ascii="Courier New" w:hAnsi="Courier New" w:cs="Courier New"/>
+                <w:sz w:val="20"/>
+                <w:szCs w:val="20"/>
+                <w:lang w:val="uk-UA"/>
+              </w:rPr>
+              <w:t xml:space="preserve">        case '-':</w:t>
+            </w:r>
+          </w:p>
+          <w:p>
+            <w:pPr>
+              <w:ind w:firstLine="0"/>
+              <w:rPr>
+                <w:rFonts w:ascii="Courier New" w:hAnsi="Courier New" w:cs="Courier New"/>
+                <w:sz w:val="20"/>
+                <w:szCs w:val="20"/>
+                <w:lang w:val="uk-UA"/>
+              </w:rPr>
+            </w:pPr>
+            <w:r>
+              <w:rPr>
+                <w:rFonts w:ascii="Courier New" w:hAnsi="Courier New" w:cs="Courier New"/>
+                <w:sz w:val="20"/>
+                <w:szCs w:val="20"/>
+                <w:lang w:val="uk-UA"/>
+              </w:rPr>
+              <w:t xml:space="preserve">            return minus(x, y)</w:t>
+            </w:r>
+          </w:p>
+          <w:p>
+            <w:pPr>
+              <w:ind w:firstLine="0"/>
+              <w:rPr>
+                <w:rFonts w:ascii="Courier New" w:hAnsi="Courier New" w:cs="Courier New"/>
+                <w:sz w:val="20"/>
+                <w:szCs w:val="20"/>
+                <w:lang w:val="uk-UA"/>
+              </w:rPr>
+            </w:pPr>
+            <w:r>
+              <w:rPr>
+                <w:rFonts w:ascii="Courier New" w:hAnsi="Courier New" w:cs="Courier New"/>
+                <w:sz w:val="20"/>
+                <w:szCs w:val="20"/>
+                <w:lang w:val="uk-UA"/>
+              </w:rPr>
+              <w:t xml:space="preserve">        case '*':</w:t>
+            </w:r>
+          </w:p>
+          <w:p>
+            <w:pPr>
+              <w:ind w:firstLine="0"/>
+              <w:rPr>
+                <w:rFonts w:ascii="Courier New" w:hAnsi="Courier New" w:cs="Courier New"/>
+                <w:sz w:val="20"/>
+                <w:szCs w:val="20"/>
+                <w:lang w:val="uk-UA"/>
+              </w:rPr>
+            </w:pPr>
+            <w:r>
+              <w:rPr>
+                <w:rFonts w:ascii="Courier New" w:hAnsi="Courier New" w:cs="Courier New"/>
+                <w:sz w:val="20"/>
+                <w:szCs w:val="20"/>
+                <w:lang w:val="uk-UA"/>
+              </w:rPr>
+              <w:t xml:space="preserve">            return mnozennia(x, y)</w:t>
+            </w:r>
+          </w:p>
+          <w:p>
+            <w:pPr>
+              <w:ind w:firstLine="0"/>
+              <w:rPr>
+                <w:rFonts w:ascii="Courier New" w:hAnsi="Courier New" w:cs="Courier New"/>
+                <w:sz w:val="20"/>
+                <w:szCs w:val="20"/>
+                <w:lang w:val="uk-UA"/>
+              </w:rPr>
+            </w:pPr>
+            <w:r>
+              <w:rPr>
+                <w:rFonts w:ascii="Courier New" w:hAnsi="Courier New" w:cs="Courier New"/>
+                <w:sz w:val="20"/>
+                <w:szCs w:val="20"/>
+                <w:lang w:val="uk-UA"/>
+              </w:rPr>
+              <w:t xml:space="preserve">        case '/':</w:t>
+            </w:r>
+          </w:p>
+          <w:p>
+            <w:pPr>
+              <w:ind w:firstLine="0"/>
+              <w:rPr>
+                <w:rFonts w:ascii="Courier New" w:hAnsi="Courier New" w:cs="Courier New"/>
+                <w:sz w:val="20"/>
+                <w:szCs w:val="20"/>
+                <w:lang w:val="uk-UA"/>
+              </w:rPr>
+            </w:pPr>
+            <w:r>
+              <w:rPr>
+                <w:rFonts w:ascii="Courier New" w:hAnsi="Courier New" w:cs="Courier New"/>
+                <w:sz w:val="20"/>
+                <w:szCs w:val="20"/>
+                <w:lang w:val="uk-UA"/>
+              </w:rPr>
+              <w:t xml:space="preserve">            return dilennia(x, y)</w:t>
+            </w:r>
+          </w:p>
+          <w:p>
+            <w:pPr>
+              <w:ind w:firstLine="0"/>
+              <w:rPr>
+                <w:rFonts w:ascii="Courier New" w:hAnsi="Courier New" w:cs="Courier New"/>
+                <w:sz w:val="20"/>
+                <w:szCs w:val="20"/>
+                <w:lang w:val="uk-UA"/>
+              </w:rPr>
+            </w:pPr>
+            <w:r>
+              <w:rPr>
+                <w:rFonts w:ascii="Courier New" w:hAnsi="Courier New" w:cs="Courier New"/>
+                <w:sz w:val="20"/>
+                <w:szCs w:val="20"/>
+                <w:lang w:val="uk-UA"/>
+              </w:rPr>
+              <w:t xml:space="preserve">        case _:</w:t>
+            </w:r>
+          </w:p>
+          <w:p>
+            <w:pPr>
+              <w:ind w:firstLine="0"/>
+              <w:rPr>
+                <w:rFonts w:ascii="Courier New" w:hAnsi="Courier New" w:cs="Courier New"/>
+                <w:sz w:val="20"/>
+                <w:szCs w:val="20"/>
+                <w:lang w:val="uk-UA"/>
+              </w:rPr>
+            </w:pPr>
+            <w:r>
+              <w:rPr>
+                <w:rFonts w:ascii="Courier New" w:hAnsi="Courier New" w:cs="Courier New"/>
+                <w:sz w:val="20"/>
+                <w:szCs w:val="20"/>
+                <w:lang w:val="uk-UA"/>
+              </w:rPr>
+              <w:t xml:space="preserve">            return "Помилка: невідома операція!"</w:t>
+            </w:r>
+          </w:p>
+          <w:p>
+            <w:pPr>
+              <w:ind w:firstLine="0"/>
+              <w:rPr>
+                <w:rFonts w:ascii="Courier New" w:hAnsi="Courier New" w:cs="Courier New"/>
+                <w:sz w:val="20"/>
+                <w:szCs w:val="20"/>
+                <w:lang w:val="uk-UA"/>
+              </w:rPr>
+            </w:pPr>
+            <w:r>
+              <w:rPr>
+                <w:rFonts w:ascii="Courier New" w:hAnsi="Courier New" w:cs="Courier New"/>
+                <w:sz w:val="20"/>
+                <w:szCs w:val="20"/>
+                <w:lang w:val="uk-UA"/>
+              </w:rPr>
+              <w:t>print("10 * 5 =", calc_match(10, 5, '*'))</w:t>
+            </w:r>
+          </w:p>
+          <w:p>
+            <w:pPr>
+              <w:ind w:firstLine="0"/>
+              <w:rPr>
+                <w:rFonts w:ascii="Courier New" w:hAnsi="Courier New" w:cs="Courier New"/>
+                <w:sz w:val="20"/>
+                <w:szCs w:val="20"/>
+                <w:lang w:val="uk-UA"/>
+              </w:rPr>
+            </w:pPr>
+            <w:r>
+              <w:rPr>
+                <w:rFonts w:ascii="Courier New" w:hAnsi="Courier New" w:cs="Courier New"/>
+                <w:sz w:val="20"/>
+                <w:szCs w:val="20"/>
+                <w:lang w:val="uk-UA"/>
+              </w:rPr>
+              <w:t>print("10 - 2 =", calc_match(10, 2, '-'))</w:t>
+            </w:r>
+          </w:p>
+        </w:tc>
+      </w:tr>
+    </w:tbl>
+    <w:p>
+      <w:pPr>
+        <w:rPr>
+          <w:lang w:val="uk-UA"/>
+        </w:rPr>
+      </w:pPr>
+    </w:p>
+    <w:p>
+      <w:pPr>
+        <w:rPr>
+          <w:lang w:val="ru-RU"/>
+        </w:rPr>
+      </w:pPr>
+      <w:r>
+        <w:rPr>
+          <w:lang w:val="uk-UA"/>
+        </w:rPr>
+        <w:t xml:space="preserve">Посилання на </w:t>
+      </w:r>
+      <w:r>
+        <w:t>github</w:t>
+      </w:r>
+      <w:r>
+        <w:rPr>
+          <w:lang w:val="ru-RU"/>
+        </w:rPr>
+        <w:t>:</w:t>
+      </w:r>
+    </w:p>
+    <w:p>
+      <w:pPr>
+        <w:ind w:right="-705" w:hanging="284"/>
+        <w:rPr>
+          <w:lang w:val="ru-RU"/>
+        </w:rPr>
+      </w:pPr>
+      <w:r>
+        <w:rPr>
+          <w:lang w:val="ru-RU"/>
+        </w:rPr>
+        <w:t>https://github.com/YaroslavH787/TP-KB-251-Yaroslav-Hrab/blob/main/topic_0</w:t>
+      </w:r>
+      <w:r>
+        <w:rPr>
+          <w:lang w:val="ru-RU"/>
+        </w:rPr>
+        <w:t>2</w:t>
+      </w:r>
+      <w:r>
+        <w:rPr>
+          <w:lang w:val="ru-RU"/>
+        </w:rPr>
+        <w:t>/task</w:t>
+      </w:r>
+      <w:r>
+        <w:rPr>
+          <w:lang w:val="ru-RU"/>
+        </w:rPr>
+        <w:t>3</w:t>
+      </w:r>
+      <w:r>
+        <w:rPr>
+          <w:lang w:val="ru-RU"/>
+        </w:rPr>
+        <w:t>.py</w:t>
+      </w:r>
+    </w:p>
+    <w:p>
+      <w:pPr>
+        <w:rPr>
+          <w:lang w:val="ru-RU"/>
+        </w:rPr>
+      </w:pPr>
+      <w:r>
+        <w:rPr>
+          <w:lang w:val="uk-UA"/>
+        </w:rPr>
+        <w:t xml:space="preserve">Знімок екрану з посилання на </w:t>
+      </w:r>
+      <w:r>
+        <w:t>github</w:t>
+      </w:r>
+      <w:r>
+        <w:rPr>
+          <w:lang w:val="ru-RU"/>
+        </w:rPr>
+        <w:t>:</w:t>
+      </w:r>
+    </w:p>
+    <w:p>
+      <w:pPr>
+        <w:ind w:firstLine="0"/>
+        <w:rPr>
+          <w:lang w:val="ru-RU"/>
+        </w:rPr>
+      </w:pPr>
+      <w:r>
+        <w:rPr>
+          <w:lang w:val="ru-RU"/>
+        </w:rPr>
+        <w:lastRenderedPageBreak/>
+        <w:drawing>
+          <wp:inline distT="0" distB="0" distL="0" distR="0" wp14:anchorId="6521675B" wp14:editId="56C32CB2">
+            <wp:extent cx="5943600" cy="4623435"/>
+            <wp:effectExtent l="0" t="0" r="0" b="5715"/>
+            <wp:docPr id="9" name="Рисунок 9"/>
+            <wp:cNvGraphicFramePr>
+              <a:graphicFrameLocks xmlns:a="http://schemas.openxmlformats.org/drawingml/2006/main" noChangeAspect="1"/>
+            </wp:cNvGraphicFramePr>
+            <a:graphic xmlns:a="http://schemas.openxmlformats.org/drawingml/2006/main">
+              <a:graphicData uri="http://schemas.openxmlformats.org/drawingml/2006/picture">
+                <pic:pic xmlns:pic="http://schemas.openxmlformats.org/drawingml/2006/picture">
+                  <pic:nvPicPr>
+                    <pic:cNvPr id="1" name=""/>
+                    <pic:cNvPicPr/>
+                  </pic:nvPicPr>
+                  <pic:blipFill>
+                    <a:blip r:embed="rId11"/>
+                    <a:stretch>
+                      <a:fillRect/>
+                    </a:stretch>
+                  </pic:blipFill>
+                  <pic:spPr>
+                    <a:xfrm>
+                      <a:off x="0" y="0"/>
+                      <a:ext cx="5943600" cy="4623435"/>
+                    </a:xfrm>
+                    <a:prstGeom prst="rect">
+                      <a:avLst/>
+                    </a:prstGeom>
+                  </pic:spPr>
+                </pic:pic>
+              </a:graphicData>
+            </a:graphic>
+          </wp:inline>
+        </w:drawing>
+      </w:r>
     </w:p>
     <w:sectPr>
       <w:pgSz w:w="12240" w:h="15840"/>
@@ -1063,6 +3016,181 @@
 <file path=word/numbering.xml><?xml version="1.0" encoding="utf-8"?>
 <w:numbering xmlns:wpc="http://schemas.microsoft.com/office/word/2010/wordprocessingCanvas" xmlns:cx="http://schemas.microsoft.com/office/drawing/2014/chartex" xmlns:cx1="http://schemas.microsoft.com/office/drawing/2015/9/8/chartex" xmlns:cx2="http://schemas.microsoft.com/office/drawing/2015/10/21/chartex" xmlns:cx3="http://schemas.microsoft.com/office/drawing/2016/5/9/chartex" xmlns:cx4="http://schemas.microsoft.com/office/drawing/2016/5/10/chartex" xmlns:cx5="http://schemas.microsoft.com/office/drawing/2016/5/11/chartex" xmlns:cx6="http://schemas.microsoft.com/office/drawing/2016/5/12/chartex" xmlns:cx7="http://schemas.microsoft.com/office/drawing/2016/5/13/chartex" xmlns:cx8="http://schemas.microsoft.com/office/drawing/2016/5/14/chartex" xmlns:mc="http://schemas.openxmlformats.org/markup-compatibility/2006" xmlns:aink="http://schemas.microsoft.com/office/drawing/2016/ink" xmlns:am3d="http://schemas.microsoft.com/office/drawing/2017/model3d" xmlns:o="urn:schemas-microsoft-com:office:office" xmlns:r="http://schemas.openxmlformats.org/officeDocument/2006/relationships" xmlns:m="http://schemas.openxmlformats.org/officeDocument/2006/math" xmlns:v="urn:schemas-microsoft-com:vml" xmlns:wp14="http://schemas.microsoft.com/office/word/2010/wordprocessingDrawing" xmlns:wp="http://schemas.openxmlformats.org/drawingml/2006/wordprocessingDrawing" xmlns:w10="urn:schemas-microsoft-com:office:word" xmlns:w="http://schemas.openxmlformats.org/wordprocessingml/2006/main" xmlns:w14="http://schemas.microsoft.com/office/word/2010/wordml" xmlns:w15="http://schemas.microsoft.com/office/word/2012/wordml" xmlns:w16cex="http://schemas.microsoft.com/office/word/2018/wordml/cex" xmlns:w16cid="http://schemas.microsoft.com/office/word/2016/wordml/cid" xmlns:w16="http://schemas.microsoft.com/office/word/2018/wordml" xmlns:w16sdtdh="http://schemas.microsoft.com/office/word/2020/wordml/sdtdatahash" xmlns:w16se="http://schemas.microsoft.com/office/word/2015/wordml/symex" xmlns:wpg="http://schemas.microsoft.com/office/word/2010/wordprocessingGroup" xmlns:wpi="http://schemas.microsoft.com/office/word/2010/wordprocessingInk" xmlns:wne="http://schemas.microsoft.com/office/word/2006/wordml" xmlns:wps="http://schemas.microsoft.com/office/word/2010/wordprocessingShape" mc:Ignorable="w14 w15 w16se w16cid w16 w16cex w16sdtdh wp14">
   <w:abstractNum w:abstractNumId="0" w15:restartNumberingAfterBreak="0">
+    <w:nsid w:val="2EE36F28"/>
+    <w:multiLevelType w:val="hybridMultilevel"/>
+    <w:tmpl w:val="E2986CD6"/>
+    <w:lvl w:ilvl="0" w:tplc="EED27F30">
+      <w:start w:val="1"/>
+      <w:numFmt w:val="decimal"/>
+      <w:lvlText w:val="%1."/>
+      <w:lvlJc w:val="left"/>
+      <w:pPr>
+        <w:ind w:left="1080" w:hanging="360"/>
+      </w:pPr>
+      <w:rPr>
+        <w:rFonts w:hint="default"/>
+      </w:rPr>
+    </w:lvl>
+    <w:lvl w:ilvl="1" w:tplc="04190019" w:tentative="1">
+      <w:start w:val="1"/>
+      <w:numFmt w:val="lowerLetter"/>
+      <w:lvlText w:val="%2."/>
+      <w:lvlJc w:val="left"/>
+      <w:pPr>
+        <w:ind w:left="1800" w:hanging="360"/>
+      </w:pPr>
+    </w:lvl>
+    <w:lvl w:ilvl="2" w:tplc="0419001B" w:tentative="1">
+      <w:start w:val="1"/>
+      <w:numFmt w:val="lowerRoman"/>
+      <w:lvlText w:val="%3."/>
+      <w:lvlJc w:val="right"/>
+      <w:pPr>
+        <w:ind w:left="2520" w:hanging="180"/>
+      </w:pPr>
+    </w:lvl>
+    <w:lvl w:ilvl="3" w:tplc="0419000F" w:tentative="1">
+      <w:start w:val="1"/>
+      <w:numFmt w:val="decimal"/>
+      <w:lvlText w:val="%4."/>
+      <w:lvlJc w:val="left"/>
+      <w:pPr>
+        <w:ind w:left="3240" w:hanging="360"/>
+      </w:pPr>
+    </w:lvl>
+    <w:lvl w:ilvl="4" w:tplc="04190019" w:tentative="1">
+      <w:start w:val="1"/>
+      <w:numFmt w:val="lowerLetter"/>
+      <w:lvlText w:val="%5."/>
+      <w:lvlJc w:val="left"/>
+      <w:pPr>
+        <w:ind w:left="3960" w:hanging="360"/>
+      </w:pPr>
+    </w:lvl>
+    <w:lvl w:ilvl="5" w:tplc="0419001B" w:tentative="1">
+      <w:start w:val="1"/>
+      <w:numFmt w:val="lowerRoman"/>
+      <w:lvlText w:val="%6."/>
+      <w:lvlJc w:val="right"/>
+      <w:pPr>
+        <w:ind w:left="4680" w:hanging="180"/>
+      </w:pPr>
+    </w:lvl>
+    <w:lvl w:ilvl="6" w:tplc="0419000F" w:tentative="1">
+      <w:start w:val="1"/>
+      <w:numFmt w:val="decimal"/>
+      <w:lvlText w:val="%7."/>
+      <w:lvlJc w:val="left"/>
+      <w:pPr>
+        <w:ind w:left="5400" w:hanging="360"/>
+      </w:pPr>
+    </w:lvl>
+    <w:lvl w:ilvl="7" w:tplc="04190019" w:tentative="1">
+      <w:start w:val="1"/>
+      <w:numFmt w:val="lowerLetter"/>
+      <w:lvlText w:val="%8."/>
+      <w:lvlJc w:val="left"/>
+      <w:pPr>
+        <w:ind w:left="6120" w:hanging="360"/>
+      </w:pPr>
+    </w:lvl>
+    <w:lvl w:ilvl="8" w:tplc="0419001B" w:tentative="1">
+      <w:start w:val="1"/>
+      <w:numFmt w:val="lowerRoman"/>
+      <w:lvlText w:val="%9."/>
+      <w:lvlJc w:val="right"/>
+      <w:pPr>
+        <w:ind w:left="6840" w:hanging="180"/>
+      </w:pPr>
+    </w:lvl>
+  </w:abstractNum>
+  <w:abstractNum w:abstractNumId="1" w15:restartNumberingAfterBreak="0">
+    <w:nsid w:val="61597136"/>
+    <w:multiLevelType w:val="hybridMultilevel"/>
+    <w:tmpl w:val="CBC02F5A"/>
+    <w:lvl w:ilvl="0" w:tplc="04090011">
+      <w:start w:val="1"/>
+      <w:numFmt w:val="decimal"/>
+      <w:lvlText w:val="%1)"/>
+      <w:lvlJc w:val="left"/>
+      <w:pPr>
+        <w:ind w:left="720" w:hanging="360"/>
+      </w:pPr>
+    </w:lvl>
+    <w:lvl w:ilvl="1" w:tplc="04090019">
+      <w:start w:val="1"/>
+      <w:numFmt w:val="lowerLetter"/>
+      <w:lvlText w:val="%2."/>
+      <w:lvlJc w:val="left"/>
+      <w:pPr>
+        <w:ind w:left="1440" w:hanging="360"/>
+      </w:pPr>
+    </w:lvl>
+    <w:lvl w:ilvl="2" w:tplc="0409001B">
+      <w:start w:val="1"/>
+      <w:numFmt w:val="lowerRoman"/>
+      <w:lvlText w:val="%3."/>
+      <w:lvlJc w:val="right"/>
+      <w:pPr>
+        <w:ind w:left="2160" w:hanging="180"/>
+      </w:pPr>
+    </w:lvl>
+    <w:lvl w:ilvl="3" w:tplc="0409000F">
+      <w:start w:val="1"/>
+      <w:numFmt w:val="decimal"/>
+      <w:lvlText w:val="%4."/>
+      <w:lvlJc w:val="left"/>
+      <w:pPr>
+        <w:ind w:left="2880" w:hanging="360"/>
+      </w:pPr>
+    </w:lvl>
+    <w:lvl w:ilvl="4" w:tplc="04090019">
+      <w:start w:val="1"/>
+      <w:numFmt w:val="lowerLetter"/>
+      <w:lvlText w:val="%5."/>
+      <w:lvlJc w:val="left"/>
+      <w:pPr>
+        <w:ind w:left="3600" w:hanging="360"/>
+      </w:pPr>
+    </w:lvl>
+    <w:lvl w:ilvl="5" w:tplc="0409001B">
+      <w:start w:val="1"/>
+      <w:numFmt w:val="lowerRoman"/>
+      <w:lvlText w:val="%6."/>
+      <w:lvlJc w:val="right"/>
+      <w:pPr>
+        <w:ind w:left="4320" w:hanging="180"/>
+      </w:pPr>
+    </w:lvl>
+    <w:lvl w:ilvl="6" w:tplc="0409000F">
+      <w:start w:val="1"/>
+      <w:numFmt w:val="decimal"/>
+      <w:lvlText w:val="%7."/>
+      <w:lvlJc w:val="left"/>
+      <w:pPr>
+        <w:ind w:left="5040" w:hanging="360"/>
+      </w:pPr>
+    </w:lvl>
+    <w:lvl w:ilvl="7" w:tplc="04090019">
+      <w:start w:val="1"/>
+      <w:numFmt w:val="lowerLetter"/>
+      <w:lvlText w:val="%8."/>
+      <w:lvlJc w:val="left"/>
+      <w:pPr>
+        <w:ind w:left="5760" w:hanging="360"/>
+      </w:pPr>
+    </w:lvl>
+    <w:lvl w:ilvl="8" w:tplc="0409001B">
+      <w:start w:val="1"/>
+      <w:numFmt w:val="lowerRoman"/>
+      <w:lvlText w:val="%9."/>
+      <w:lvlJc w:val="right"/>
+      <w:pPr>
+        <w:ind w:left="6480" w:hanging="180"/>
+      </w:pPr>
+    </w:lvl>
+  </w:abstractNum>
+  <w:abstractNum w:abstractNumId="2" w15:restartNumberingAfterBreak="0">
     <w:nsid w:val="6CE54FE5"/>
     <w:multiLevelType w:val="hybridMultilevel"/>
     <w:tmpl w:val="E6D05908"/>
@@ -1152,6 +3280,39 @@
     </w:lvl>
   </w:abstractNum>
   <w:num w:numId="1">
+    <w:abstractNumId w:val="2"/>
+  </w:num>
+  <w:num w:numId="2">
+    <w:abstractNumId w:val="1"/>
+    <w:lvlOverride w:ilvl="0">
+      <w:startOverride w:val="1"/>
+    </w:lvlOverride>
+    <w:lvlOverride w:ilvl="1">
+      <w:startOverride w:val="1"/>
+    </w:lvlOverride>
+    <w:lvlOverride w:ilvl="2">
+      <w:startOverride w:val="1"/>
+    </w:lvlOverride>
+    <w:lvlOverride w:ilvl="3">
+      <w:startOverride w:val="1"/>
+    </w:lvlOverride>
+    <w:lvlOverride w:ilvl="4">
+      <w:startOverride w:val="1"/>
+    </w:lvlOverride>
+    <w:lvlOverride w:ilvl="5">
+      <w:startOverride w:val="1"/>
+    </w:lvlOverride>
+    <w:lvlOverride w:ilvl="6">
+      <w:startOverride w:val="1"/>
+    </w:lvlOverride>
+    <w:lvlOverride w:ilvl="7">
+      <w:startOverride w:val="1"/>
+    </w:lvlOverride>
+    <w:lvlOverride w:ilvl="8">
+      <w:startOverride w:val="1"/>
+    </w:lvlOverride>
+  </w:num>
+  <w:num w:numId="3">
     <w:abstractNumId w:val="0"/>
   </w:num>
 </w:numbering>
@@ -1623,6 +3784,41 @@
       <w:contextualSpacing/>
     </w:pPr>
   </w:style>
+  <w:style w:type="character" w:styleId="a5">
+    <w:name w:val="Hyperlink"/>
+    <w:basedOn w:val="a0"/>
+    <w:uiPriority w:val="99"/>
+    <w:unhideWhenUsed/>
+    <w:rsid w:val="00BC2ADE"/>
+    <w:rPr>
+      <w:color w:val="0563C1" w:themeColor="hyperlink"/>
+      <w:u w:val="single"/>
+    </w:rPr>
+  </w:style>
+  <w:style w:type="character" w:styleId="a6">
+    <w:name w:val="Unresolved Mention"/>
+    <w:basedOn w:val="a0"/>
+    <w:uiPriority w:val="99"/>
+    <w:semiHidden/>
+    <w:unhideWhenUsed/>
+    <w:rsid w:val="00BC2ADE"/>
+    <w:rPr>
+      <w:color w:val="605E5C"/>
+      <w:shd w:val="clear" w:color="auto" w:fill="E1DFDD"/>
+    </w:rPr>
+  </w:style>
+  <w:style w:type="character" w:styleId="a7">
+    <w:name w:val="FollowedHyperlink"/>
+    <w:basedOn w:val="a0"/>
+    <w:uiPriority w:val="99"/>
+    <w:semiHidden/>
+    <w:unhideWhenUsed/>
+    <w:rsid w:val="00BC2ADE"/>
+    <w:rPr>
+      <w:color w:val="954F72" w:themeColor="followedHyperlink"/>
+      <w:u w:val="single"/>
+    </w:rPr>
+  </w:style>
 </w:styles>
 </file>
 

</xml_diff>